<commit_message>
Add per-job resume/cover-letter style switch (modern | classic)
Renderers now support two interchangeable looks selectable per application via
a "style" key in the JSON (or a CLI arg): "modern" (Helvetica/Calibri + navy,
for tech/SaaS/growth) and "classic" (Times serif, black, no accent, for
traditional/industrial/finance/legal/government). Both stay single-column,
real-text, ATS-safe. Output now prints STYLE=<name> alongside PAGES/fill.

- build/render_resume.py, build/render_cover_letter.py: theme system threaded
  through PDF + DOCX builders; bullets use the theme font.
- SKILL.md: Step 5/6/7 document choosing the style and matching the cover
  letter to the resume.
- README: note the two styles.
- DwyerOmega (industrial Key Account Manager) re-rendered in classic serif;
  Superhuman stays modern.

Co-Authored-By: Claude Opus 4.8 <noreply@anthropic.com>
Claude-Session: https://claude.ai/code/session_01DWCndSHUY36iUE78QRf4C9
</commit_message>
<xml_diff>
--- a/applications/dwyeromega-key-account-manager/cover-letter.docx
+++ b/applications/dwyeromega-key-account-manager/cover-letter.docx
@@ -9,9 +9,9 @@
       </w:pPr>
       <w:r>
         <w:rPr>
-          <w:rFonts w:ascii="Calibri" w:hAnsi="Calibri"/>
+          <w:rFonts w:ascii="Times New Roman" w:hAnsi="Times New Roman"/>
           <w:b/>
-          <w:color w:val="163A5F"/>
+          <w:color w:val="1A1A1A"/>
           <w:sz w:val="36"/>
         </w:rPr>
         <w:t>Joshua Rotenberg</w:t>
@@ -24,7 +24,7 @@
       </w:pPr>
       <w:r>
         <w:rPr>
-          <w:rFonts w:ascii="Calibri" w:hAnsi="Calibri"/>
+          <w:rFonts w:ascii="Times New Roman" w:hAnsi="Times New Roman"/>
           <w:b w:val="0"/>
           <w:color w:val="555555"/>
           <w:sz w:val="18"/>
@@ -38,7 +38,7 @@
       </w:pPr>
       <w:r>
         <w:rPr>
-          <w:rFonts w:ascii="Calibri" w:hAnsi="Calibri"/>
+          <w:rFonts w:ascii="Times New Roman" w:hAnsi="Times New Roman"/>
           <w:b w:val="0"/>
           <w:color w:val="1A1A1A"/>
         </w:rPr>
@@ -51,7 +51,7 @@
       </w:pPr>
       <w:r>
         <w:rPr>
-          <w:rFonts w:ascii="Calibri" w:hAnsi="Calibri"/>
+          <w:rFonts w:ascii="Times New Roman" w:hAnsi="Times New Roman"/>
           <w:b/>
           <w:color w:val="1A1A1A"/>
         </w:rPr>
@@ -64,7 +64,7 @@
       </w:pPr>
       <w:r>
         <w:rPr>
-          <w:rFonts w:ascii="Calibri" w:hAnsi="Calibri"/>
+          <w:rFonts w:ascii="Times New Roman" w:hAnsi="Times New Roman"/>
           <w:b w:val="0"/>
           <w:color w:val="1A1A1A"/>
         </w:rPr>
@@ -77,7 +77,7 @@
       </w:pPr>
       <w:r>
         <w:rPr>
-          <w:rFonts w:ascii="Calibri" w:hAnsi="Calibri"/>
+          <w:rFonts w:ascii="Times New Roman" w:hAnsi="Times New Roman"/>
           <w:b w:val="0"/>
           <w:color w:val="1A1A1A"/>
         </w:rPr>
@@ -90,7 +90,7 @@
       </w:pPr>
       <w:r>
         <w:rPr>
-          <w:rFonts w:ascii="Calibri" w:hAnsi="Calibri"/>
+          <w:rFonts w:ascii="Times New Roman" w:hAnsi="Times New Roman"/>
           <w:b w:val="0"/>
           <w:color w:val="1A1A1A"/>
         </w:rPr>
@@ -103,7 +103,7 @@
       </w:pPr>
       <w:r>
         <w:rPr>
-          <w:rFonts w:ascii="Calibri" w:hAnsi="Calibri"/>
+          <w:rFonts w:ascii="Times New Roman" w:hAnsi="Times New Roman"/>
           <w:b w:val="0"/>
           <w:color w:val="1A1A1A"/>
         </w:rPr>
@@ -116,7 +116,7 @@
       </w:pPr>
       <w:r>
         <w:rPr>
-          <w:rFonts w:ascii="Calibri" w:hAnsi="Calibri"/>
+          <w:rFonts w:ascii="Times New Roman" w:hAnsi="Times New Roman"/>
           <w:b w:val="0"/>
           <w:color w:val="1A1A1A"/>
         </w:rPr>
@@ -129,7 +129,7 @@
       </w:pPr>
       <w:r>
         <w:rPr>
-          <w:rFonts w:ascii="Calibri" w:hAnsi="Calibri"/>
+          <w:rFonts w:ascii="Times New Roman" w:hAnsi="Times New Roman"/>
           <w:b w:val="0"/>
           <w:color w:val="1A1A1A"/>
         </w:rPr>
@@ -142,7 +142,7 @@
       </w:pPr>
       <w:r>
         <w:rPr>
-          <w:rFonts w:ascii="Calibri" w:hAnsi="Calibri"/>
+          <w:rFonts w:ascii="Times New Roman" w:hAnsi="Times New Roman"/>
           <w:b w:val="0"/>
           <w:color w:val="1A1A1A"/>
         </w:rPr>
@@ -526,7 +526,7 @@
       <w:spacing w:line="259" w:lineRule="auto"/>
     </w:pPr>
     <w:rPr>
-      <w:rFonts w:ascii="Calibri" w:hAnsi="Calibri" w:cs="Calibri"/>
+      <w:rFonts w:ascii="Times New Roman" w:hAnsi="Times New Roman" w:cs="Times New Roman"/>
       <w:color w:val="1A1A1A"/>
       <w:sz w:val="21"/>
     </w:rPr>

</xml_diff>